<commit_message>
Rewrite the CV, mark ThemeGrill as past, and rename the snippet plugin
The CV gets larger body text at one page, a headline that names the
specialism, install counts in place of raw commit counts, and the
suite-wide security work in its own group. ThemeGrill is now Jan 2023
to Oct 2026 on the CV and the site, with past-tense copy and no
worksFor in the JSON-LD. Custom Code Snippets Manager is now
SnippetCrate, with a public repo and 188 of 188 commits.

Co-Authored-By: Claude Opus 5.5 (1M context) <noreply@anthropic.com>
</commit_message>
<xml_diff>
--- a/cv/milan-cv.docx
+++ b/cv/milan-cv.docx
@@ -1,6 +1,6 @@
 
 <file path=word/document.xml><?xml version="1.0" encoding="utf-8"?>
-<w:document xmlns:o="urn:schemas-microsoft-com:office:office" xmlns:r="http://schemas.openxmlformats.org/officeDocument/2006/relationships" xmlns:v="urn:schemas-microsoft-com:vml" xmlns:w="http://schemas.openxmlformats.org/wordprocessingml/2006/main" xmlns:w10="urn:schemas-microsoft-com:office:word" xmlns:wp="http://schemas.openxmlformats.org/drawingml/2006/wordprocessingDrawing" xmlns:wps="http://schemas.microsoft.com/office/word/2010/wordprocessingShape" xmlns:wpg="http://schemas.microsoft.com/office/word/2010/wordprocessingGroup" xmlns:mc="http://schemas.openxmlformats.org/markup-compatibility/2006" xmlns:wp14="http://schemas.microsoft.com/office/word/2010/wordprocessingDrawing" xmlns:w14="http://schemas.microsoft.com/office/word/2010/wordml" xmlns:w15="http://schemas.microsoft.com/office/word/2012/wordml" mc:Ignorable="w14 wp14 w15">
+<w:document xmlns:o="urn:schemas-microsoft-com:office:office" xmlns:r="http://schemas.openxmlformats.org/officeDocument/2006/relationships" xmlns:v="urn:schemas-microsoft-com:vml" xmlns:w="http://schemas.openxmlformats.org/wordprocessingml/2006/main" xmlns:w10="urn:schemas-microsoft-com:office:word" xmlns:wp="http://schemas.openxmlformats.org/drawingml/2006/wordprocessingDrawing" xmlns:pic="http://schemas.openxmlformats.org/drawingml/2006/picture" xmlns:wps="http://schemas.microsoft.com/office/word/2010/wordprocessingShape" xmlns:wpg="http://schemas.microsoft.com/office/word/2010/wordprocessingGroup" xmlns:mc="http://schemas.openxmlformats.org/markup-compatibility/2006" xmlns:wp14="http://schemas.microsoft.com/office/word/2010/wordprocessingDrawing" xmlns:w14="http://schemas.microsoft.com/office/word/2010/wordml" xmlns:w15="http://schemas.microsoft.com/office/word/2012/wordml" mc:Ignorable="w14 wp14 w15">
   <w:body>
     <w:p>
       <w:pPr>
@@ -24,7 +24,7 @@
       </w:pPr>
       <w:r>
         <w:rPr/>
-        <w:t>Software Engineer — PHP, React, Python</w:t>
+        <w:t>Software Engineer — WordPress plugins, payments and application security</w:t>
       </w:r>
     </w:p>
     <w:p>
@@ -72,7 +72,27 @@
       </w:hyperlink>
       <w:r>
         <w:rPr/>
-        <w:t xml:space="preserve">  |  Nepal · UTC+5:45 · open to remote </w:t>
+        <w:t xml:space="preserve"> </w:t>
+      </w:r>
+    </w:p>
+    <w:p>
+      <w:pPr>
+        <w:pStyle w:val="BodyTextmeta"/>
+        <w:bidi w:val="0"/>
+        <w:jc w:val="left"/>
+        <w:rPr/>
+      </w:pPr>
+      <w:hyperlink r:id="rId5">
+        <w:r>
+          <w:rPr>
+            <w:rStyle w:val="Hyperlink"/>
+          </w:rPr>
+          <w:t>profiles.wordpress.org/wpmilan</w:t>
+        </w:r>
+      </w:hyperlink>
+      <w:r>
+        <w:rPr/>
+        <w:t xml:space="preserve">  |  Nepal · UTC+5:45 · available now, open to remote</w:t>
       </w:r>
     </w:p>
     <w:p>
@@ -96,7 +116,7 @@
       </w:pPr>
       <w:r>
         <w:rPr/>
-        <w:t xml:space="preserve">Full-stack engineer with four years building WordPress plugins and the Python services behind them. Shipped features now run on about 150,000 active installs. Deepest work is on the payment path and security: four gateways across two products, and 52 security and hardening fixes across nine plugins. Built and deployed the Python service behind Everest Forms’ AI form builder, and runs the Linux and Docker hosts under it. </w:t>
+        <w:t xml:space="preserve">Software engineer with four years building WordPress plugins and the Python services behind them, on products with about 150,000 active installs. Deepest work is on payments and security: four gateways across two products, and 52 security and hardening fixes across nine plugins. Built and deployed the FastAPI service behind Everest Forms’ AI form builder, and ran the Linux and Docker hosts under it. </w:t>
       </w:r>
     </w:p>
     <w:p>
@@ -121,14 +141,14 @@
       </w:pPr>
       <w:r>
         <w:rPr/>
-        <w:t xml:space="preserve">Software Engineer (PHP, React, Python) — ThemeGrill Pvt Ltd, Kathmandu (hybrid) </w:t>
+        <w:t xml:space="preserve">Software Engineer — ThemeGrill Pvt Ltd, Kathmandu (hybrid) </w:t>
       </w:r>
       <w:r>
         <w:rPr>
           <w:b w:val="false"/>
           <w:color w:val="3D4551"/>
         </w:rPr>
-        <w:t>| Jan 2023 – Present</w:t>
+        <w:t>| Jan 2023 – Oct 2026</w:t>
       </w:r>
     </w:p>
     <w:p>
@@ -140,7 +160,7 @@
       </w:pPr>
       <w:r>
         <w:rPr/>
-        <w:t xml:space="preserve">Seven WordPress products with about 150,000 active installs between them. Joined as a plugin intern on a live plugin, then moved onto the product teams. </w:t>
+        <w:t xml:space="preserve">Seven WordPress products with about 150,000 active installs between them. Joined the User Registration team as an intern, was contributing to the plugin within two weeks, and moved into the engineer role after a month. </w:t>
       </w:r>
     </w:p>
     <w:p>
@@ -152,7 +172,7 @@
       </w:pPr>
       <w:r>
         <w:rPr/>
-        <w:t>Everest Forms · 90,000 installs · 492 commits across free and pro</w:t>
+        <w:t>Everest Forms · 90,000 active installs</w:t>
       </w:r>
     </w:p>
     <w:p>
@@ -174,7 +194,7 @@
       </w:pPr>
       <w:r>
         <w:rPr/>
-        <w:t xml:space="preserve">Built the AI form builder end to end: the Python and FastAPI service, the prompt setup, and the WordPress side that calls it, so no API key ships inside the plugin. </w:t>
+        <w:t xml:space="preserve">Built the AI form builder end to end: a Python and FastAPI service, the prompt setup and the WordPress side that calls it, so no API key ships in the plugin. </w:t>
       </w:r>
     </w:p>
     <w:p>
@@ -196,7 +216,7 @@
       </w:pPr>
       <w:r>
         <w:rPr/>
-        <w:t xml:space="preserve">Divider field, multiple-select support, lookup field styling, and range slider and single-item options in calculations. </w:t>
+        <w:t xml:space="preserve">Added the divider field, multiple-select support, lookup field styling, and range slider and single-item options in calculations. </w:t>
       </w:r>
     </w:p>
     <w:p>
@@ -217,7 +237,7 @@
       </w:pPr>
       <w:r>
         <w:rPr/>
-        <w:t xml:space="preserve">17 security fixes, from an unsafe unserialize() call on old PHP to nonce verification when several forms share a page, entry permissions and file-upload capability checks. </w:t>
+        <w:t xml:space="preserve">Fixed 17 security issues, including an unsafe unserialize() call, nonce checks when several forms share a page, entry permissions and file-upload capability checks. </w:t>
       </w:r>
     </w:p>
     <w:p>
@@ -229,7 +249,7 @@
       </w:pPr>
       <w:r>
         <w:rPr/>
-        <w:t>User Registration &amp; Membership · 50,000 installs · 273 commits across core and pro</w:t>
+        <w:t>User Registration &amp; Membership · 50,000 active installs</w:t>
       </w:r>
     </w:p>
     <w:p>
@@ -251,7 +271,7 @@
       </w:pPr>
       <w:r>
         <w:rPr/>
-        <w:t xml:space="preserve">Moved PayPal onto its REST API with webhooks and stricter IPN checks, fixed Stripe charging the wrong currency when a plan had no local price, stopped Mollie retries charging twice, and added signature checks and a retry flow to Authorize.Net. </w:t>
+        <w:t xml:space="preserve">Moved PayPal onto its REST API with webhooks and stricter IPN checks, fixed Stripe charging the wrong currency when a plan had no local price, stopped Mollie retries charging twice, and added signature checks to Authorize.Net. </w:t>
       </w:r>
     </w:p>
     <w:p>
@@ -273,7 +293,7 @@
       </w:pPr>
       <w:r>
         <w:rPr/>
-        <w:t xml:space="preserve">Patched unauthenticated privilege escalation and user deletion, arbitrary shortcode execution through user-controlled smart tags, and a PayPal flaw that let a pending payment be marked completed without payment. </w:t>
+        <w:t xml:space="preserve">Patched unauthenticated privilege escalation and user deletion, shortcode execution through user-controlled smart tags, and a PayPal flaw that let an unpaid order be marked completed. </w:t>
       </w:r>
     </w:p>
     <w:p>
@@ -294,7 +314,7 @@
       </w:pPr>
       <w:r>
         <w:rPr/>
-        <w:t xml:space="preserve">Built the content drip module and the membership upgrade flow, plus work across 26 add-ons. </w:t>
+        <w:t xml:space="preserve">Built the content drip module and the membership upgrade flow, and worked across 26 add-ons. </w:t>
       </w:r>
     </w:p>
     <w:p>
@@ -306,7 +326,7 @@
       </w:pPr>
       <w:r>
         <w:rPr/>
-        <w:t>SmartSMTP · 303 of its 331 commits</w:t>
+        <w:t>SmartSMTP · wrote 303 of its 331 commits</w:t>
       </w:r>
     </w:p>
     <w:p>
@@ -327,7 +347,7 @@
       </w:pPr>
       <w:r>
         <w:rPr/>
-        <w:t xml:space="preserve">Built most of the plugin, from early versions through its first public releases: main and fallback connections, provider setup, test mail, attachment handling and the delivery log. Fixed a stored XSS in the mail log viewer. </w:t>
+        <w:t xml:space="preserve">Built most of the plugin through its first public releases: main and fallback connections, provider setup, test mail, attachments and the delivery log. Fixed a stored XSS in the mail log viewer. </w:t>
       </w:r>
     </w:p>
     <w:p>
@@ -339,7 +359,7 @@
       </w:pPr>
       <w:r>
         <w:rPr/>
-        <w:t>BlockArt, Magazine Blocks and WooCommerce extensions · 162 commits in Customize My Account</w:t>
+        <w:t>BlockArt, Magazine Blocks and Customize My Account for WooCommerce</w:t>
       </w:r>
     </w:p>
     <w:p>
@@ -354,14 +374,25 @@
           <w:tab w:val="left" w:pos="709" w:leader="none"/>
         </w:tabs>
         <w:bidi w:val="0"/>
-        <w:spacing w:before="0" w:after="0"/>
         <w:ind w:hanging="283" w:left="709"/>
         <w:jc w:val="left"/>
         <w:rPr/>
       </w:pPr>
       <w:r>
         <w:rPr/>
-        <w:t xml:space="preserve">Gutenberg blocks in React across free and pro, capability checks on editor actions, and the Customize My Account colour palette manager, navigation layout and live previews. </w:t>
+        <w:t xml:space="preserve">Built Gutenberg blocks in React across free and pro, added capability checks on editor actions, and built the Customize My Account colour palette manager, navigation layout and live previews. </w:t>
+      </w:r>
+    </w:p>
+    <w:p>
+      <w:pPr>
+        <w:pStyle w:val="BodyTextprod"/>
+        <w:bidi w:val="0"/>
+        <w:jc w:val="left"/>
+        <w:rPr/>
+      </w:pPr>
+      <w:r>
+        <w:rPr/>
+        <w:t>Across the products</w:t>
       </w:r>
     </w:p>
     <w:p>
@@ -369,7 +400,7 @@
         <w:pStyle w:val="BodyText"/>
         <w:numPr>
           <w:ilvl w:val="0"/>
-          <w:numId w:val="4"/>
+          <w:numId w:val="5"/>
         </w:numPr>
         <w:tabs>
           <w:tab w:val="clear" w:pos="1134"/>
@@ -383,7 +414,7 @@
       </w:pPr>
       <w:r>
         <w:rPr/>
-        <w:t xml:space="preserve">Across the suite: 52 security and hardening fixes in nine plugins, including Snyk triage, and cutting the paired free and pro releases. </w:t>
+        <w:t xml:space="preserve">Shipped 52 security and hardening fixes across nine plugins, triaged Snyk findings, and cut the paired free and pro releases. </w:t>
       </w:r>
     </w:p>
     <w:p>
@@ -391,7 +422,7 @@
         <w:pStyle w:val="BodyText"/>
         <w:numPr>
           <w:ilvl w:val="0"/>
-          <w:numId w:val="4"/>
+          <w:numId w:val="5"/>
         </w:numPr>
         <w:tabs>
           <w:tab w:val="clear" w:pos="1134"/>
@@ -404,7 +435,7 @@
       </w:pPr>
       <w:r>
         <w:rPr/>
-        <w:t xml:space="preserve">Verified fixes in a real WordPress install by driving Playwright over MCP with Claude Code, with custom agent skills holding the coding standards and the debug routine. </w:t>
+        <w:t xml:space="preserve">Verified fixes in a live WordPress install with Playwright over MCP and Claude Code, using custom agent skills for coding standards and debugging. </w:t>
       </w:r>
     </w:p>
     <w:p>
@@ -432,7 +463,7 @@
         <w:pStyle w:val="BodyText"/>
         <w:numPr>
           <w:ilvl w:val="0"/>
-          <w:numId w:val="5"/>
+          <w:numId w:val="6"/>
         </w:numPr>
         <w:tabs>
           <w:tab w:val="clear" w:pos="1134"/>
@@ -445,7 +476,7 @@
       </w:pPr>
       <w:r>
         <w:rPr/>
-        <w:t xml:space="preserve">Backend work on Oxole, a site where students swapped textbooks: sign-up, book listings, search, exchange requests and profile pages. Plain PHP in an MVC layout with jQuery, Ajax, Twig templates and hand-written SQL. </w:t>
+        <w:t xml:space="preserve">Worked on the backend of Oxole, a textbook-swap site for students: sign-up, listings, search, exchange requests and profiles, in plain PHP (MVC) with jQuery, Ajax, Twig and hand-written SQL. </w:t>
       </w:r>
     </w:p>
     <w:p>
@@ -489,11 +520,11 @@
         <w:rPr>
           <w:rStyle w:val="Strong"/>
         </w:rPr>
-        <w:t>Frontend:</w:t>
-      </w:r>
-      <w:r>
-        <w:rPr/>
-        <w:t xml:space="preserve"> React, Gutenberg blocks, Next.js, Tailwind CSS, jQuery, accessibility</w:t>
+        <w:t>Backend:</w:t>
+      </w:r>
+      <w:r>
+        <w:rPr/>
+        <w:t xml:space="preserve"> WordPress plugin architecture, REST APIs, WooCommerce, FastAPI, Laravel, Slim</w:t>
       </w:r>
     </w:p>
     <w:p>
@@ -507,11 +538,11 @@
         <w:rPr>
           <w:rStyle w:val="Strong"/>
         </w:rPr>
-        <w:t>Backend:</w:t>
-      </w:r>
-      <w:r>
-        <w:rPr/>
-        <w:t xml:space="preserve"> FastAPI, REST APIs, WordPress plugin architecture, WooCommerce, Laravel, Slim</w:t>
+        <w:t>Frontend:</w:t>
+      </w:r>
+      <w:r>
+        <w:rPr/>
+        <w:t xml:space="preserve"> React, Gutenberg blocks, jQuery, Next.js, Tailwind CSS, accessibility</w:t>
       </w:r>
     </w:p>
     <w:p>
@@ -529,7 +560,7 @@
       </w:r>
       <w:r>
         <w:rPr/>
-        <w:t xml:space="preserve"> PostgreSQL, MySQL, Redis</w:t>
+        <w:t xml:space="preserve"> MySQL, PostgreSQL, Redis</w:t>
       </w:r>
     </w:p>
     <w:p>
@@ -547,7 +578,7 @@
       </w:r>
       <w:r>
         <w:rPr/>
-        <w:t xml:space="preserve"> Docker, Linux, Nginx, Prometheus, Grafana, GitHub Actions, Git</w:t>
+        <w:t xml:space="preserve"> Linux, Docker, Nginx, Git, GitHub Actions</w:t>
       </w:r>
     </w:p>
     <w:p>
@@ -565,7 +596,7 @@
       </w:r>
       <w:r>
         <w:rPr/>
-        <w:t xml:space="preserve"> Payment gateway integration, application security, PHPCS coding standards, Playwright, code review, release management for paired free and pro plugins</w:t>
+        <w:t xml:space="preserve"> Payment gateway integration, application security, PHPCS, Playwright, code review, release management</w:t>
       </w:r>
     </w:p>
     <w:p>
@@ -596,7 +627,7 @@
       </w:r>
       <w:r>
         <w:rPr/>
-        <w:t xml:space="preserve"> — Sambhram Institute of Technology, Bengaluru </w:t>
+        <w:t xml:space="preserve"> — Sambhram Institute of Technology (VTU), Bengaluru </w:t>
       </w:r>
       <w:r>
         <w:rPr>
@@ -608,18 +639,6 @@
     </w:p>
     <w:p>
       <w:pPr>
-        <w:pStyle w:val="BodyTextjobnote"/>
-        <w:bidi w:val="0"/>
-        <w:jc w:val="left"/>
-        <w:rPr/>
-      </w:pPr>
-      <w:r>
-        <w:rPr/>
-        <w:t>Visvesvaraya Technological University</w:t>
-      </w:r>
-    </w:p>
-    <w:p>
-      <w:pPr>
         <w:pStyle w:val="Heading2"/>
         <w:bidi w:val="0"/>
         <w:jc w:val="left"/>
@@ -627,7 +646,7 @@
       </w:pPr>
       <w:r>
         <w:rPr/>
-        <w:t>Projects and other work</w:t>
+        <w:t>Projects</w:t>
       </w:r>
     </w:p>
     <w:p>
@@ -635,7 +654,7 @@
         <w:pStyle w:val="BodyText"/>
         <w:numPr>
           <w:ilvl w:val="0"/>
-          <w:numId w:val="6"/>
+          <w:numId w:val="7"/>
         </w:numPr>
         <w:tabs>
           <w:tab w:val="clear" w:pos="1134"/>
@@ -651,11 +670,23 @@
         <w:rPr>
           <w:rStyle w:val="Strong"/>
         </w:rPr>
-        <w:t>Custom Code Snippets Manager</w:t>
-      </w:r>
-      <w:r>
-        <w:rPr/>
-        <w:t xml:space="preserve"> — own WordPress plugin for running PHP, JavaScript, CSS or HTML snippets without editing theme files. Designed and built solo, 171 of 171 commits. Pre-release. </w:t>
+        <w:t>SnippetCrate</w:t>
+      </w:r>
+      <w:r>
+        <w:rPr/>
+        <w:t xml:space="preserve"> — </w:t>
+      </w:r>
+      <w:hyperlink r:id="rId6">
+        <w:r>
+          <w:rPr>
+            <w:rStyle w:val="Hyperlink"/>
+          </w:rPr>
+          <w:t>github.com/MILAN88888/snippetcrate</w:t>
+        </w:r>
+      </w:hyperlink>
+      <w:r>
+        <w:rPr/>
+        <w:t xml:space="preserve"> — own WordPress plugin for PHP, JavaScript, CSS and HTML snippets, with live syntax checking so invalid code cannot be saved. Built solo in PHP and React, 188 of 188 commits. Pre-release. </w:t>
       </w:r>
     </w:p>
     <w:p>
@@ -663,7 +694,7 @@
         <w:pStyle w:val="BodyText"/>
         <w:numPr>
           <w:ilvl w:val="0"/>
-          <w:numId w:val="6"/>
+          <w:numId w:val="7"/>
         </w:numPr>
         <w:tabs>
           <w:tab w:val="clear" w:pos="1134"/>
@@ -678,11 +709,23 @@
         <w:rPr>
           <w:rStyle w:val="Strong"/>
         </w:rPr>
-        <w:t>milanc.com.np</w:t>
-      </w:r>
-      <w:r>
-        <w:rPr/>
-        <w:t xml:space="preserve"> — static Next.js portfolio carrying the commit counts and install figures behind everything above. </w:t>
+        <w:t>PromptDeck</w:t>
+      </w:r>
+      <w:r>
+        <w:rPr/>
+        <w:t xml:space="preserve"> — </w:t>
+      </w:r>
+      <w:hyperlink r:id="rId7">
+        <w:r>
+          <w:rPr>
+            <w:rStyle w:val="Hyperlink"/>
+          </w:rPr>
+          <w:t>github.com/MILAN88888/promptdeck</w:t>
+        </w:r>
+      </w:hyperlink>
+      <w:r>
+        <w:rPr/>
+        <w:t xml:space="preserve"> — Linux desktop app in Tauri (Rust and JavaScript) that turns markdown files into copyable prompt blocks, with a global shortcut to search them. Released as .deb and AppImage. </w:t>
       </w:r>
     </w:p>
     <w:p>
@@ -694,30 +737,21 @@
       </w:pPr>
       <w:r>
         <w:rPr/>
-        <w:t>Languages &amp; certifications</w:t>
+        <w:t>Languages &amp; community</w:t>
       </w:r>
     </w:p>
     <w:p>
       <w:pPr>
         <w:pStyle w:val="BodyText"/>
         <w:bidi w:val="0"/>
-        <w:jc w:val="left"/>
-        <w:rPr/>
-      </w:pPr>
-      <w:r>
-        <w:rPr/>
-        <w:t>Nepali · Hindi · English</w:t>
-      </w:r>
-    </w:p>
-    <w:p>
-      <w:pPr>
-        <w:pStyle w:val="BodyText"/>
-        <w:bidi w:val="0"/>
         <w:spacing w:before="0" w:after="20"/>
-        <w:ind w:hanging="0" w:left="0" w:right="0"/>
-        <w:jc w:val="left"/>
-        <w:rPr/>
-      </w:pPr>
+        <w:jc w:val="left"/>
+        <w:rPr/>
+      </w:pPr>
+      <w:r>
+        <w:rPr/>
+        <w:t xml:space="preserve">English (professional) · Nepali (native) · Hindi (fluent)  |  </w:t>
+      </w:r>
       <w:r>
         <w:rPr>
           <w:rStyle w:val="Strong"/>
@@ -726,24 +760,17 @@
       </w:r>
       <w:r>
         <w:rPr/>
-        <w:t xml:space="preserve"> — Contributor Day participant </w:t>
-      </w:r>
-      <w:r>
-        <w:rPr>
-          <w:b w:val="false"/>
-          <w:color w:val="3D4551"/>
-        </w:rPr>
-        <w:t>| Sep 2023</w:t>
+        <w:t xml:space="preserve"> — Contributor Day, Sep 2023</w:t>
       </w:r>
     </w:p>
     <w:sectPr>
       <w:type w:val="nextPage"/>
       <w:pgSz w:w="11906" w:h="16838"/>
-      <w:pgMar w:left="737" w:right="737" w:gutter="0" w:header="0" w:top="624" w:footer="0" w:bottom="624"/>
+      <w:pgMar w:left="1134" w:right="567" w:gutter="0" w:header="0" w:top="567" w:footer="0" w:bottom="567"/>
       <w:pgNumType w:fmt="decimal"/>
       <w:formProt w:val="false"/>
       <w:textDirection w:val="lrTb"/>
-      <w:docGrid w:type="default" w:linePitch="600" w:charSpace="48332"/>
+      <w:docGrid w:type="default" w:linePitch="600" w:charSpace="45056"/>
     </w:sectPr>
   </w:body>
 </w:document>
@@ -1576,9 +1603,146 @@
   <w:abstractNum w:abstractNumId="7">
     <w:lvl w:ilvl="0">
       <w:start w:val="1"/>
+      <w:numFmt w:val="bullet"/>
+      <w:lvlText w:val=""/>
+      <w:lvlJc w:val="left"/>
+      <w:pPr>
+        <w:tabs>
+          <w:tab w:val="num" w:pos="709"/>
+        </w:tabs>
+        <w:ind w:left="709" w:hanging="283"/>
+      </w:pPr>
+      <w:rPr>
+        <w:rFonts w:ascii="Symbol" w:hAnsi="Symbol" w:cs="Symbol" w:hint="default"/>
+      </w:rPr>
+    </w:lvl>
+    <w:lvl w:ilvl="1">
+      <w:start w:val="1"/>
+      <w:numFmt w:val="bullet"/>
+      <w:lvlText w:val=""/>
+      <w:lvlJc w:val="left"/>
+      <w:pPr>
+        <w:tabs>
+          <w:tab w:val="num" w:pos="1418"/>
+        </w:tabs>
+        <w:ind w:left="1418" w:hanging="283"/>
+      </w:pPr>
+      <w:rPr>
+        <w:rFonts w:ascii="Symbol" w:hAnsi="Symbol" w:cs="Symbol" w:hint="default"/>
+      </w:rPr>
+    </w:lvl>
+    <w:lvl w:ilvl="2">
+      <w:start w:val="1"/>
+      <w:numFmt w:val="bullet"/>
+      <w:lvlText w:val=""/>
+      <w:lvlJc w:val="left"/>
+      <w:pPr>
+        <w:tabs>
+          <w:tab w:val="num" w:pos="2127"/>
+        </w:tabs>
+        <w:ind w:left="2127" w:hanging="283"/>
+      </w:pPr>
+      <w:rPr>
+        <w:rFonts w:ascii="Symbol" w:hAnsi="Symbol" w:cs="Symbol" w:hint="default"/>
+      </w:rPr>
+    </w:lvl>
+    <w:lvl w:ilvl="3">
+      <w:start w:val="1"/>
+      <w:numFmt w:val="bullet"/>
+      <w:lvlText w:val=""/>
+      <w:lvlJc w:val="left"/>
+      <w:pPr>
+        <w:tabs>
+          <w:tab w:val="num" w:pos="2836"/>
+        </w:tabs>
+        <w:ind w:left="2836" w:hanging="283"/>
+      </w:pPr>
+      <w:rPr>
+        <w:rFonts w:ascii="Symbol" w:hAnsi="Symbol" w:cs="Symbol" w:hint="default"/>
+      </w:rPr>
+    </w:lvl>
+    <w:lvl w:ilvl="4">
+      <w:start w:val="1"/>
+      <w:numFmt w:val="bullet"/>
+      <w:lvlText w:val=""/>
+      <w:lvlJc w:val="left"/>
+      <w:pPr>
+        <w:tabs>
+          <w:tab w:val="num" w:pos="3545"/>
+        </w:tabs>
+        <w:ind w:left="3545" w:hanging="283"/>
+      </w:pPr>
+      <w:rPr>
+        <w:rFonts w:ascii="Symbol" w:hAnsi="Symbol" w:cs="Symbol" w:hint="default"/>
+      </w:rPr>
+    </w:lvl>
+    <w:lvl w:ilvl="5">
+      <w:start w:val="1"/>
+      <w:numFmt w:val="bullet"/>
+      <w:lvlText w:val=""/>
+      <w:lvlJc w:val="left"/>
+      <w:pPr>
+        <w:tabs>
+          <w:tab w:val="num" w:pos="4254"/>
+        </w:tabs>
+        <w:ind w:left="4254" w:hanging="283"/>
+      </w:pPr>
+      <w:rPr>
+        <w:rFonts w:ascii="Symbol" w:hAnsi="Symbol" w:cs="Symbol" w:hint="default"/>
+      </w:rPr>
+    </w:lvl>
+    <w:lvl w:ilvl="6">
+      <w:start w:val="1"/>
+      <w:numFmt w:val="bullet"/>
+      <w:lvlText w:val=""/>
+      <w:lvlJc w:val="left"/>
+      <w:pPr>
+        <w:tabs>
+          <w:tab w:val="num" w:pos="4963"/>
+        </w:tabs>
+        <w:ind w:left="4963" w:hanging="283"/>
+      </w:pPr>
+      <w:rPr>
+        <w:rFonts w:ascii="Symbol" w:hAnsi="Symbol" w:cs="Symbol" w:hint="default"/>
+      </w:rPr>
+    </w:lvl>
+    <w:lvl w:ilvl="7">
+      <w:start w:val="1"/>
+      <w:numFmt w:val="bullet"/>
+      <w:lvlText w:val=""/>
+      <w:lvlJc w:val="left"/>
+      <w:pPr>
+        <w:tabs>
+          <w:tab w:val="num" w:pos="5672"/>
+        </w:tabs>
+        <w:ind w:left="5672" w:hanging="283"/>
+      </w:pPr>
+      <w:rPr>
+        <w:rFonts w:ascii="Symbol" w:hAnsi="Symbol" w:cs="Symbol" w:hint="default"/>
+      </w:rPr>
+    </w:lvl>
+    <w:lvl w:ilvl="8">
+      <w:start w:val="1"/>
+      <w:numFmt w:val="bullet"/>
+      <w:lvlText w:val=""/>
+      <w:lvlJc w:val="left"/>
+      <w:pPr>
+        <w:tabs>
+          <w:tab w:val="num" w:pos="6381"/>
+        </w:tabs>
+        <w:ind w:left="6381" w:hanging="283"/>
+      </w:pPr>
+      <w:rPr>
+        <w:rFonts w:ascii="Symbol" w:hAnsi="Symbol" w:cs="Symbol" w:hint="default"/>
+      </w:rPr>
+    </w:lvl>
+  </w:abstractNum>
+  <w:abstractNum w:abstractNumId="8">
+    <w:lvl w:ilvl="0">
+      <w:start w:val="1"/>
       <w:numFmt w:val="none"/>
       <w:suff w:val="nothing"/>
-      <w:lvlText w:val="%1"/>
+      <w:lvlText w:val=""/>
       <w:lvlJc w:val="left"/>
       <w:pPr>
         <w:tabs>
@@ -1589,10 +1753,23 @@
     </w:lvl>
     <w:lvl w:ilvl="1">
       <w:start w:val="1"/>
+      <w:numFmt w:val="none"/>
       <w:pStyle w:val="Heading2"/>
+      <w:suff w:val="nothing"/>
+      <w:lvlText w:val=""/>
+      <w:lvlJc w:val="left"/>
+      <w:pPr>
+        <w:tabs>
+          <w:tab w:val="num" w:pos="0"/>
+        </w:tabs>
+        <w:ind w:left="0" w:hanging="0"/>
+      </w:pPr>
+    </w:lvl>
+    <w:lvl w:ilvl="2">
+      <w:start w:val="1"/>
       <w:numFmt w:val="none"/>
       <w:suff w:val="nothing"/>
-      <w:lvlText w:val="%2"/>
+      <w:lvlText w:val=""/>
       <w:lvlJc w:val="left"/>
       <w:pPr>
         <w:tabs>
@@ -1601,11 +1778,11 @@
         <w:ind w:left="0" w:hanging="0"/>
       </w:pPr>
     </w:lvl>
-    <w:lvl w:ilvl="2">
+    <w:lvl w:ilvl="3">
       <w:start w:val="1"/>
       <w:numFmt w:val="none"/>
       <w:suff w:val="nothing"/>
-      <w:lvlText w:val="%3"/>
+      <w:lvlText w:val=""/>
       <w:lvlJc w:val="left"/>
       <w:pPr>
         <w:tabs>
@@ -1614,11 +1791,11 @@
         <w:ind w:left="0" w:hanging="0"/>
       </w:pPr>
     </w:lvl>
-    <w:lvl w:ilvl="3">
+    <w:lvl w:ilvl="4">
       <w:start w:val="1"/>
       <w:numFmt w:val="none"/>
       <w:suff w:val="nothing"/>
-      <w:lvlText w:val="%4"/>
+      <w:lvlText w:val=""/>
       <w:lvlJc w:val="left"/>
       <w:pPr>
         <w:tabs>
@@ -1627,11 +1804,11 @@
         <w:ind w:left="0" w:hanging="0"/>
       </w:pPr>
     </w:lvl>
-    <w:lvl w:ilvl="4">
+    <w:lvl w:ilvl="5">
       <w:start w:val="1"/>
       <w:numFmt w:val="none"/>
       <w:suff w:val="nothing"/>
-      <w:lvlText w:val="%5"/>
+      <w:lvlText w:val=""/>
       <w:lvlJc w:val="left"/>
       <w:pPr>
         <w:tabs>
@@ -1640,11 +1817,11 @@
         <w:ind w:left="0" w:hanging="0"/>
       </w:pPr>
     </w:lvl>
-    <w:lvl w:ilvl="5">
+    <w:lvl w:ilvl="6">
       <w:start w:val="1"/>
       <w:numFmt w:val="none"/>
       <w:suff w:val="nothing"/>
-      <w:lvlText w:val="%6"/>
+      <w:lvlText w:val=""/>
       <w:lvlJc w:val="left"/>
       <w:pPr>
         <w:tabs>
@@ -1653,11 +1830,11 @@
         <w:ind w:left="0" w:hanging="0"/>
       </w:pPr>
     </w:lvl>
-    <w:lvl w:ilvl="6">
+    <w:lvl w:ilvl="7">
       <w:start w:val="1"/>
       <w:numFmt w:val="none"/>
       <w:suff w:val="nothing"/>
-      <w:lvlText w:val="%7"/>
+      <w:lvlText w:val=""/>
       <w:lvlJc w:val="left"/>
       <w:pPr>
         <w:tabs>
@@ -1666,24 +1843,11 @@
         <w:ind w:left="0" w:hanging="0"/>
       </w:pPr>
     </w:lvl>
-    <w:lvl w:ilvl="7">
+    <w:lvl w:ilvl="8">
       <w:start w:val="1"/>
       <w:numFmt w:val="none"/>
       <w:suff w:val="nothing"/>
-      <w:lvlText w:val="%8"/>
-      <w:lvlJc w:val="left"/>
-      <w:pPr>
-        <w:tabs>
-          <w:tab w:val="num" w:pos="0"/>
-        </w:tabs>
-        <w:ind w:left="0" w:hanging="0"/>
-      </w:pPr>
-    </w:lvl>
-    <w:lvl w:ilvl="8">
-      <w:start w:val="1"/>
-      <w:numFmt w:val="none"/>
-      <w:suff w:val="nothing"/>
-      <w:lvlText w:val="%9"/>
+      <w:lvlText w:val=""/>
       <w:lvlJc w:val="left"/>
       <w:pPr>
         <w:tabs>
@@ -1714,6 +1878,9 @@
   <w:num w:numId="7">
     <w:abstractNumId w:val="7"/>
   </w:num>
+  <w:num w:numId="8">
+    <w:abstractNumId w:val="8"/>
+  </w:num>
 </w:numbering>
 </file>
 
@@ -1740,18 +1907,18 @@
     <w:pPr>
       <w:widowControl w:val="false"/>
       <w:bidi w:val="0"/>
-      <w:spacing w:lineRule="auto" w:line="268"/>
+      <w:spacing w:lineRule="auto" w:line="269"/>
     </w:pPr>
     <w:rPr>
       <w:rFonts w:ascii="Liberation Sans;Arial;sans-serif" w:hAnsi="Liberation Sans;Arial;sans-serif" w:eastAsia="Liberation Sans;Arial;sans-serif" w:cs="Liberation Sans;Arial;sans-serif"/>
       <w:color w:val="14181F"/>
-      <w:sz w:val="16"/>
-      <w:szCs w:val="16"/>
+      <w:sz w:val="18"/>
+      <w:szCs w:val="18"/>
       <w:lang w:val="en-US" w:eastAsia="zh-CN" w:bidi="hi-IN"/>
     </w:rPr>
   </w:style>
   <w:style w:type="paragraph" w:styleId="Heading1">
-    <w:name w:val="Heading 1"/>
+    <w:name w:val="heading 1"/>
     <w:basedOn w:val="Heading"/>
     <w:next w:val="BodyText"/>
     <w:qFormat/>
@@ -1759,7 +1926,6 @@
       <w:spacing w:before="240" w:after="40"/>
     </w:pPr>
     <w:rPr>
-      <w:rFonts w:ascii="Noto Sans" w:hAnsi="Noto Sans"/>
       <w:b/>
       <w:bCs/>
       <w:caps/>
@@ -1768,7 +1934,7 @@
     </w:rPr>
   </w:style>
   <w:style w:type="paragraph" w:styleId="Heading2">
-    <w:name w:val="Heading 2"/>
+    <w:name w:val="heading 2"/>
     <w:basedOn w:val="Heading"/>
     <w:next w:val="BodyText"/>
     <w:qFormat/>
@@ -1776,8 +1942,8 @@
       <w:pBdr>
         <w:bottom w:val="single" w:sz="8" w:space="1" w:color="C3CCD8"/>
       </w:pBdr>
-      <w:spacing w:before="110" w:after="50"/>
-      <w:ind w:left="110" w:right="110"/>
+      <w:spacing w:before="80" w:after="30"/>
+      <w:ind w:left="80" w:right="80"/>
       <w:outlineLvl w:val="1"/>
     </w:pPr>
     <w:rPr>
@@ -1786,8 +1952,20 @@
       <w:bCs/>
       <w:caps/>
       <w:color w:val="0B4FD0"/>
-      <w:sz w:val="19"/>
-      <w:szCs w:val="19"/>
+      <w:sz w:val="20"/>
+      <w:szCs w:val="20"/>
+    </w:rPr>
+  </w:style>
+  <w:style w:type="character" w:styleId="EndnoteReference">
+    <w:name w:val="endnote reference"/>
+    <w:rPr>
+      <w:vertAlign w:val="superscript"/>
+    </w:rPr>
+  </w:style>
+  <w:style w:type="character" w:styleId="FootnoteReference">
+    <w:name w:val="footnote reference"/>
+    <w:rPr>
+      <w:vertAlign w:val="superscript"/>
     </w:rPr>
   </w:style>
   <w:style w:type="character" w:styleId="EndnoteCharacters">
@@ -1851,7 +2029,7 @@
     </w:rPr>
   </w:style>
   <w:style w:type="paragraph" w:styleId="EnvelopeReturn">
-    <w:name w:val="Envelope Return"/>
+    <w:name w:val="envelope return"/>
     <w:basedOn w:val="Normal"/>
     <w:pPr/>
     <w:rPr>
@@ -1863,46 +2041,6 @@
     <w:basedOn w:val="BodyText"/>
     <w:qFormat/>
     <w:pPr/>
-    <w:rPr/>
-  </w:style>
-  <w:style w:type="paragraph" w:styleId="Footer">
-    <w:name w:val="Footer"/>
-    <w:basedOn w:val="Normal"/>
-    <w:pPr>
-      <w:suppressLineNumbers/>
-      <w:tabs>
-        <w:tab w:val="clear" w:pos="1134"/>
-        <w:tab w:val="center" w:pos="4818" w:leader="none"/>
-        <w:tab w:val="right" w:pos="9637" w:leader="none"/>
-      </w:tabs>
-    </w:pPr>
-    <w:rPr/>
-  </w:style>
-  <w:style w:type="paragraph" w:styleId="Header">
-    <w:name w:val="Header"/>
-    <w:basedOn w:val="Normal"/>
-    <w:pPr>
-      <w:suppressLineNumbers/>
-      <w:tabs>
-        <w:tab w:val="clear" w:pos="1134"/>
-        <w:tab w:val="center" w:pos="4818" w:leader="none"/>
-        <w:tab w:val="right" w:pos="9637" w:leader="none"/>
-      </w:tabs>
-    </w:pPr>
-    <w:rPr/>
-  </w:style>
-  <w:style w:type="paragraph" w:styleId="HeaderandFooter">
-    <w:name w:val="Header and Footer"/>
-    <w:basedOn w:val="Normal"/>
-    <w:qFormat/>
-    <w:pPr>
-      <w:suppressLineNumbers/>
-      <w:tabs>
-        <w:tab w:val="clear" w:pos="1134"/>
-        <w:tab w:val="center" w:pos="4819" w:leader="none"/>
-        <w:tab w:val="right" w:pos="9638" w:leader="none"/>
-      </w:tabs>
-    </w:pPr>
     <w:rPr/>
   </w:style>
   <w:style w:type="paragraph" w:styleId="Index">
@@ -1917,7 +2055,7 @@
     </w:rPr>
   </w:style>
   <w:style w:type="paragraph" w:styleId="Caption">
-    <w:name w:val="Caption"/>
+    <w:name w:val="caption"/>
     <w:basedOn w:val="Normal"/>
     <w:qFormat/>
     <w:pPr>
@@ -1974,8 +2112,8 @@
       <w:b/>
       <w:bCs/>
       <w:color w:val="0B4FD0"/>
-      <w:sz w:val="20"/>
-      <w:szCs w:val="20"/>
+      <w:sz w:val="21"/>
+      <w:szCs w:val="21"/>
     </w:rPr>
   </w:style>
   <w:style w:type="paragraph" w:styleId="BodyTextmeta">
@@ -1983,12 +2121,12 @@
     <w:basedOn w:val="BodyText"/>
     <w:qFormat/>
     <w:pPr>
-      <w:spacing w:before="0" w:after="40"/>
+      <w:spacing w:before="0" w:after="20"/>
     </w:pPr>
     <w:rPr>
       <w:color w:val="3D4551"/>
-      <w:sz w:val="17"/>
-      <w:szCs w:val="17"/>
+      <w:sz w:val="18"/>
+      <w:szCs w:val="18"/>
     </w:rPr>
   </w:style>
   <w:style w:type="paragraph" w:styleId="BodyTextjobtitle">
@@ -2001,8 +2139,8 @@
     <w:rPr>
       <w:b/>
       <w:bCs/>
-      <w:sz w:val="19"/>
-      <w:szCs w:val="19"/>
+      <w:sz w:val="20"/>
+      <w:szCs w:val="20"/>
     </w:rPr>
   </w:style>
   <w:style w:type="paragraph" w:styleId="BodyTextjobnote">
@@ -2031,7 +2169,7 @@
     <w:basedOn w:val="BodyText"/>
     <w:qFormat/>
     <w:pPr>
-      <w:spacing w:before="0" w:after="40"/>
+      <w:spacing w:before="0" w:after="10"/>
     </w:pPr>
     <w:rPr/>
   </w:style>
@@ -2046,37 +2184,37 @@
         <a:srgbClr val="000000"/>
       </a:dk1>
       <a:lt1>
-        <a:srgbClr val="ffffff"/>
+        <a:srgbClr val="FFFFFF"/>
       </a:lt1>
       <a:dk2>
         <a:srgbClr val="000000"/>
       </a:dk2>
       <a:lt2>
-        <a:srgbClr val="ffffff"/>
+        <a:srgbClr val="FFFFFF"/>
       </a:lt2>
       <a:accent1>
-        <a:srgbClr val="18a303"/>
+        <a:srgbClr val="18A303"/>
       </a:accent1>
       <a:accent2>
-        <a:srgbClr val="0369a3"/>
+        <a:srgbClr val="0369A3"/>
       </a:accent2>
       <a:accent3>
-        <a:srgbClr val="a33e03"/>
+        <a:srgbClr val="A33E03"/>
       </a:accent3>
       <a:accent4>
-        <a:srgbClr val="8e03a3"/>
+        <a:srgbClr val="8E03A3"/>
       </a:accent4>
       <a:accent5>
-        <a:srgbClr val="c99c00"/>
+        <a:srgbClr val="C99C00"/>
       </a:accent5>
       <a:accent6>
-        <a:srgbClr val="c9211e"/>
+        <a:srgbClr val="C9211E"/>
       </a:accent6>
       <a:hlink>
-        <a:srgbClr val="0000ee"/>
+        <a:srgbClr val="0000EE"/>
       </a:hlink>
       <a:folHlink>
-        <a:srgbClr val="551a8b"/>
+        <a:srgbClr val="551A8B"/>
       </a:folHlink>
     </a:clrScheme>
     <a:fontScheme name="Office">

</xml_diff>